<commit_message>
School extra-lessons QA: uzsiemimai terminology, Demo prefill, and paginated contracts list (20 per page).
Co-authored-by: Cursor <cursoragent@cursor.com>
</commit_message>
<xml_diff>
--- a/api/_lib/templates/extra-lessons-laisvi-vaikai.docx
+++ b/api/_lib/templates/extra-lessons-laisvi-vaikai.docx
@@ -23,7 +23,7 @@
           <w:u w:val="none"/>
           <w:lang w:val="en-US"/>
         </w:rPr>
-        <w:t xml:space="preserve">NUOTOLINIŲ PAPILDOMŲ PAMOKŲ</w:t>
+        <w:t xml:space="preserve">NUOTOLINIŲ PAPILDOMŲ UŽSIĖMIMŲ</w:t>
       </w:r>
       <w:r>
         <w:rPr>
@@ -1103,7 +1103,7 @@
           <w:u w:val="none"/>
           <w:rtl w:val="0"/>
         </w:rPr>
-        <w:t xml:space="preserve">Ši Sutartis reglamentuoja tik papildomų mokamų pamokų (ugdomųjų veiklų) paslaugą. Ji nepakeičia atskiros mokymo, ugdymo šeimoje ar kitos sutarties, kuria įforminami formaliojo švietimo santykiai.</w:t>
+        <w:t xml:space="preserve">Ši Sutartis reglamentuoja tik papildomų mokamų užsiėmimų (ugdomųjų veiklų) paslaugą. Ji nepakeičia atskiros mokymo, ugdymo šeimoje ar kitos sutarties, kuria įforminami formaliojo švietimo santykiai.</w:t>
       </w:r>
       <w:r>
         <w:rPr>
@@ -1172,7 +1172,7 @@
           <w:u w:val="none"/>
           <w:rtl w:val="0"/>
         </w:rPr>
-        <w:t xml:space="preserve">Paslaugų teikėjas įsipareigoja organizuoti vaikui užsakytas nuotolines papildomas pamokas ar ugdomąsias veiklas, o Paslaugų gavėjas įsipareigoja už tinkamai suteiktas paslaugas sumokėti šioje Sutartyje nustatyta tvarka.</w:t>
+        <w:t xml:space="preserve">Paslaugų teikėjas įsipareigoja organizuoti vaikui užsakytas nuotolines papildomus užsiėmimus ar ugdomąsias veiklas, o Paslaugų gavėjas įsipareigoja už tinkamai suteiktas paslaugas sumokėti šioje Sutartyje nustatyta tvarka.</w:t>
       </w:r>
       <w:r>
         <w:rPr>
@@ -1232,7 +1232,7 @@
                 <w:u w:val="none"/>
                 <w:rtl w:val="0"/>
               </w:rPr>
-              <w:t xml:space="preserve">Pamokos / veiklos pavadinimas</w:t>
+              <w:t xml:space="preserve">Užsiėmimo pavadinimas</w:t>
             </w:r>
             <w:r>
               <w:rPr>
@@ -1491,7 +1491,7 @@
                 <w:u w:val="none"/>
                 <w:lang w:val="en-US"/>
               </w:rPr>
-              <w:t xml:space="preserve">Pamokos trukmė</w:t>
+              <w:t xml:space="preserve">Užsiėmimo trukmė</w:t>
             </w:r>
             <w:r>
               <w:rPr>
@@ -1838,7 +1838,7 @@
                 <w:u w:val="none"/>
                 <w:rtl w:val="0"/>
               </w:rPr>
-              <w:t xml:space="preserve">Vienos pamokos kaina</w:t>
+              <w:t xml:space="preserve">Vieno užsiėmimo kaina</w:t>
             </w:r>
             <w:r>
               <w:rPr>
@@ -1967,7 +1967,7 @@
                 <w:u w:val="none"/>
                 <w:rtl w:val="0"/>
               </w:rPr>
-              <w:t xml:space="preserve">faktiškai pagal tvarkaraštį įvykusių ir pagal 4 skyriaus sąlygas apmokamų pamokų skaičius × vienos pamokos kaina</w:t>
+              <w:t xml:space="preserve">faktiškai pagal tvarkaraštį įvykusių ir pagal 4 skyriaus sąlygas apmokamų užsiėmimų skaičius × vieno užsiėmimo kaina</w:t>
             </w:r>
             <w:r>
               <w:rPr>
@@ -2055,7 +2055,7 @@
                 <w:u w:val="none"/>
                 <w:rtl w:val="0"/>
               </w:rPr>
-              <w:t xml:space="preserve">{{orientacine_menesio_kaina}} Eur; galutinė suma priklauso nuo konkretaus mėnesio pamokų skaičiaus</w:t>
+              <w:t xml:space="preserve">{{orientacine_menesio_kaina}} Eur; galutinė suma priklauso nuo konkretaus mėnesio užsiėmimų skaičiaus</w:t>
             </w:r>
             <w:r>
               <w:rPr>
@@ -2578,7 +2578,7 @@
           <w:u w:val="none"/>
           <w:rtl w:val="0"/>
         </w:rPr>
-        <w:t xml:space="preserve">4. PAMOKŲ ORGANIZAVIMAS, LANKYMAS IR ATŠAUKIMAS</w:t>
+        <w:t xml:space="preserve">4. UŽSIĖMIMŲ ORGANIZAVIMAS, LANKYMAS IR ATŠAUKIMAS</w:t>
       </w:r>
       <w:r>
         <w:rPr>
@@ -2619,7 +2619,7 @@
           <w:u w:val="none"/>
           <w:rtl w:val="0"/>
         </w:rPr>
-        <w:t xml:space="preserve">Pamokos vyksta užsakymo santraukoje nurodytoje platformoje ir pagal ten nurodytą grafiką, jeigu Šalys patvariojoje laikmenoje nesusitaria kitaip.</w:t>
+        <w:t xml:space="preserve">Užsiėmimai vyksta užsakymo santraukoje nurodytoje platformoje ir pagal ten nurodytą grafiką, jeigu Šalys patvariojoje laikmenoje nesusitaria kitaip.</w:t>
       </w:r>
       <w:r>
         <w:rPr>
@@ -2701,7 +2701,7 @@
           <w:u w:val="none"/>
           <w:rtl w:val="0"/>
         </w:rPr>
-        <w:t xml:space="preserve">Jeigu užsakyta grupinė pamoka pagal tvarkaraštį faktiškai įvyko ir vaikui buvo rezervuota vieta, pamoka yra apmokama ir tuo atveju, kai vaikas joje nedalyvavo, išskyrus teisės aktuose arba šioje Sutartyje nurodytus atvejus. Ši sąlyga prieš užsakymą turi būti aiškiai išskirta užsakymo santraukoje.</w:t>
+        <w:t xml:space="preserve">Jeigu užsakyta grupinis užsiėmimas pagal tvarkaraštį faktiškai įvyko ir vaikui buvo rezervuota vieta, užsiėmimas yra apmokama ir tuo atveju, kai vaikas joje nedalyvavo, išskyrus teisės aktuose arba šioje Sutartyje nurodytus atvejus. Ši sąlyga prieš užsakymą turi būti aiškiai išskirta užsakymo santraukoje.</w:t>
       </w:r>
       <w:r>
         <w:rPr>
@@ -2742,7 +2742,7 @@
           <w:u w:val="none"/>
           <w:rtl w:val="0"/>
         </w:rPr>
-        <w:t xml:space="preserve">Individualioms pamokoms taikomas toks atšaukimo terminas ir pasekmės: {{individualios_pamokos_atšaukimo_sąlygos}}. Jeigu individualios pamokos neteikiamos, ši nuostata Sutarties kopijoje pažymima „netaikoma“.</w:t>
+        <w:t xml:space="preserve">Individualiems užsiėmimams taikomas toks atšaukimo terminas ir pasekmės: {{individualios_pamokos_atšaukimo_sąlygos}}. Jeigu individualios užsiėmimai neteikiamos, ši nuostata Sutarties kopijoje pažymima „netaikoma“.</w:t>
       </w:r>
       <w:r>
         <w:rPr>
@@ -2783,7 +2783,7 @@
           <w:u w:val="none"/>
           <w:rtl w:val="0"/>
         </w:rPr>
-        <w:t xml:space="preserve">Jeigu pamoka neįvyksta dėl mokytojo ligos, Paslaugų teikėjo organizacinių sprendimų, jo pasirinktos platformos sutrikimo ar kitos nuo Paslaugų teikėjo priklausančios priežasties, mokestis už tokią pamoką netaikomas arba, Paslaugų gavėjui sutikus, pamoka perkeliama į kitą laiką.</w:t>
+        <w:t xml:space="preserve">Jeigu užsiėmimas neįvyksta dėl mokytojo ligos, Paslaugų teikėjo organizacinių sprendimų, jo pasirinktos platformos sutrikimo ar kitos nuo Paslaugų teikėjo priklausančios priežasties, mokestis už tokį užsiėmimą netaikomas arba, Paslaugų gavėjui sutikus, užsiėmimas perkeliama į kitą laiką.</w:t>
       </w:r>
       <w:r>
         <w:rPr>
@@ -2824,7 +2824,7 @@
           <w:u w:val="none"/>
           <w:rtl w:val="0"/>
         </w:rPr>
-        <w:t xml:space="preserve">Jeigu vaikas negali prisijungti dėl jo įrangos ar interneto ryšio sutrikimo, o paslauga kitiems dalyviams buvo tinkamai prieinama ir pamoka įvyko, taikoma 4.3 arba 4.4 punkte nustatyta mokėjimo tvarka.</w:t>
+        <w:t xml:space="preserve">Jeigu vaikas negali prisijungti dėl jo įrangos ar interneto ryšio sutrikimo, o paslauga kitiems dalyviams buvo tinkamai prieinama ir užsiėmimas įvyko, taikoma 4.3 arba 4.4 punkte nustatyta mokėjimo tvarka.</w:t>
       </w:r>
       <w:r>
         <w:rPr>
@@ -2934,7 +2934,7 @@
           <w:u w:val="none"/>
           <w:rtl w:val="0"/>
         </w:rPr>
-        <w:t xml:space="preserve">Mokestis apskaičiuojamas pagal 2 skyriuje nurodytą kainą ir faktiškai apmokamų pamokų skaičių. Paslaugų gavėjui negali būti taikomi papildomi mokesčiai, kuriems jis nebuvo aiškiai pritaręs iki užsakymo pateikimo.</w:t>
+        <w:t xml:space="preserve">Mokestis apskaičiuojamas pagal 2 skyriuje nurodytą kainą ir faktiškai apmokamų užsiėmimų skaičių. Paslaugų gavėjui negali būti taikomi papildomi mokesčiai, kuriems jis nebuvo aiškiai pritaręs iki užsakymo pateikimo.</w:t>
       </w:r>
       <w:r>
         <w:rPr>
@@ -3398,7 +3398,7 @@
           <w:u w:val="none"/>
           <w:rtl w:val="0"/>
         </w:rPr>
-        <w:t xml:space="preserve">Paslaugų gavėjui praleidus mokėjimo terminą, Paslaugų teikėjas išsiunčia priminimą ir suteikia ne trumpesnį kaip 7 (septynių) kalendorinių dienų papildomą terminą įsiskolinimui padengti. Per šį terminą nesumokėjus, Paslaugų teikėjas gali laikinai sustabdyti tolesnių pamokų teikimą, apie tai aiškiai įspėjęs Paslaugų gavėją.</w:t>
+        <w:t xml:space="preserve">Paslaugų gavėjui praleidus mokėjimo terminą, Paslaugų teikėjas išsiunčia priminimą ir suteikia ne trumpesnį kaip 7 (septynių) kalendorinių dienų papildomą terminą įsiskolinimui padengti. Per šį terminą nesumokėjus, Paslaugų teikėjas gali laikinai sustabdyti tolesnių užsiėmimų teikimą, apie tai aiškiai įspėjęs Paslaugų gavėją.</w:t>
       </w:r>
       <w:r>
         <w:rPr>
@@ -3439,7 +3439,7 @@
           <w:u w:val="none"/>
           <w:rtl w:val="0"/>
         </w:rPr>
-        <w:t xml:space="preserve">Sustabdymas nepanaikina pareigos apmokėti iki sustabdymo tinkamai suteiktas paslaugas, tačiau mokestis už po sustabdymo nesuteiktas pamokas neskaičiuojamas.</w:t>
+        <w:t xml:space="preserve">Sustabdymas nepanaikina pareigos apmokėti iki sustabdymo tinkamai suteiktas paslaugas, tačiau mokestis už po sustabdymo nesuteiktas užsiėmimas neskaičiuojamas.</w:t>
       </w:r>
       <w:r>
         <w:rPr>
@@ -3709,7 +3709,7 @@
           <w:u w:val="none"/>
           <w:rtl w:val="0"/>
         </w:rPr>
-        <w:t xml:space="preserve">Jeigu Paslaugų gavėjas pageidauja, kad pamokos būtų pradėtos teikti nepasibaigus 14 dienų terminui, jis prieš užsakymą atskiru, iš anksto nepažymėtu laukeliu pateikia aiškų prašymą: „Prašau pradėti teikti paslaugas nepasibaigus 14 dienų sutarties atsisakymo terminui. Suprantu, kad atsisakęs Sutarties turėsiu sumokėti už iki atsisakymo suteiktas paslaugas.“</w:t>
+        <w:t xml:space="preserve">Jeigu Paslaugų gavėjas pageidauja, kad užsiėmimai būtų pradėtos teikti nepasibaigus 14 dienų terminui, jis prieš užsakymą atskiru, iš anksto nepažymėtu laukeliu pateikia aiškų prašymą: „Prašau pradėti teikti paslaugas nepasibaigus 14 dienų sutarties atsisakymo terminui. Suprantu, kad atsisakęs Sutarties turėsiu sumokėti už iki atsisakymo suteiktas paslaugas.“</w:t>
       </w:r>
       <w:r>
         <w:rPr>
@@ -4061,7 +4061,7 @@
           <w:u w:val="none"/>
           <w:rtl w:val="0"/>
         </w:rPr>
-        <w:t xml:space="preserve">• grasinimus, smurtą, patyčias, neteisėtą pamokos įrašymą ar platinimą, saugumo incidentą arba kitą šiurkštų pažeidimą, dėl kurio pagrįstai negalima tęsti paslaugos;</w:t>
+        <w:t xml:space="preserve">• grasinimus, smurtą, patyčias, neteisėtą užsiėmimai įrašymą ar platinimą, saugumo incidentą arba kitą šiurkštų pažeidimą, dėl kurio pagrįstai negalima tęsti paslaugos;</w:t>
       </w:r>
       <w:r>
         <w:rPr>
@@ -4238,7 +4238,7 @@
           <w:u w:val="none"/>
           <w:rtl w:val="0"/>
         </w:rPr>
-        <w:t xml:space="preserve">8. PAMOKŲ ĮRAŠYMAS, MEDŽIAGOS IR PRIVATUMAS</w:t>
+        <w:t xml:space="preserve">8. UŽSIĖMIMŲ ĮRAŠYMAS, MEDŽIAGOS IR PRIVATUMAS</w:t>
       </w:r>
       <w:r>
         <w:rPr>
@@ -4279,7 +4279,7 @@
           <w:u w:val="none"/>
           <w:rtl w:val="0"/>
         </w:rPr>
-        <w:t xml:space="preserve">Vaiko atvaizdas, balsas, pasisakymai, vardas ir kiti pamokos metu fiksuojami duomenys yra asmens duomenys. Pamokos, kuriose gali būti užfiksuoti vaiko asmens duomenys, įrašomos tik turint aiškų teisėtą pagrindą ir prieš tai pateikus išsamią informaciją apie įrašymo tikslą, duomenų gavėjus, saugojimo terminą, prieigos sąlygas ir duomenų subjekto teises.</w:t>
+        <w:t xml:space="preserve">Vaiko atvaizdas, balsas, pasisakymai, vardas ir kiti užsiėmimai metu fiksuojami duomenys yra asmens duomenys. Užsiėmimai, kuriose gali būti užfiksuoti vaiko asmens duomenys, įrašomos tik turint aiškų teisėtą pagrindą ir prieš tai pateikus išsamią informaciją apie įrašymo tikslą, duomenų gavėjus, saugojimo terminą, prieigos sąlygas ir duomenų subjekto teises.</w:t>
       </w:r>
       <w:r>
         <w:rPr>
@@ -4320,7 +4320,7 @@
           <w:u w:val="none"/>
           <w:rtl w:val="0"/>
         </w:rPr>
-        <w:t xml:space="preserve">Kai įrašymas grindžiamas sutikimu, sutikimas gaunamas atskirai nuo Sutarties akcepto, iš anksto nepažymėtu laukeliu. Atsisakymas sutikti ar sutikimo atšaukimas savaime negali užkirsti kelio vaikui dalyvauti tiesioginėje pamokoje, jeigu įrašymas nėra objektyviai būtinas pačiai paslaugai suteikti.</w:t>
+        <w:t xml:space="preserve">Kai įrašymas grindžiamas sutikimu, sutikimas gaunamas atskirai nuo Sutarties akcepto, iš anksto nepažymėtu laukeliu. Atsisakymas sutikti ar sutikimo atšaukimas savaime negali užkirsti kelio vaikui dalyvauti tiesioginiame užsiėmime, jeigu įrašymas nėra objektyviai būtinas pačiai paslaugai suteikti.</w:t>
       </w:r>
       <w:r>
         <w:rPr>
@@ -4361,7 +4361,7 @@
           <w:u w:val="none"/>
           <w:rtl w:val="0"/>
         </w:rPr>
-        <w:t xml:space="preserve">Tutlio sistemoje įrašymo sutikimo tekstas ir būsena fiksuojami atskirai. Pavyzdinė formuluotė: „Sutinku, kad nuotolinės pamokos metu mano atstovaujamo vaiko vaizdas ir (ar) balsas būtų įrašomi tik {{tikslas}}, įrašą leidžiant peržiūrėti {{gavejai}} ir saugant ne ilgiau kaip {{saugojimo_terminas}}. Žinau, kad sutikimą galiu bet kada atšaukti, nedarant poveikio iki atšaukimo atlikto tvarkymo teisėtumui.“</w:t>
+        <w:t xml:space="preserve">Tutlio sistemoje įrašymo sutikimo tekstas ir būsena fiksuojami atskirai. Pavyzdinė formuluotė: „Sutinku, kad nuotolinės užsiėmimai metu mano atstovaujamo vaiko vaizdas ir (ar) balsas būtų įrašomi tik {{tikslas}}, įrašą leidžiant peržiūrėti {{gavejai}} ir saugant ne ilgiau kaip {{saugojimo_terminas}}. Žinau, kad sutikimą galiu bet kada atšaukti, nedarant poveikio iki atšaukimo atlikto tvarkymo teisėtumui.“</w:t>
       </w:r>
       <w:r>
         <w:rPr>
@@ -4443,7 +4443,7 @@
           <w:u w:val="none"/>
           <w:rtl w:val="0"/>
         </w:rPr>
-        <w:t xml:space="preserve">Paslaugų gavėjas ir vaikas negali be atskiro Paslaugų teikėjo ir kitų duomenų subjektų teisėto pagrindo įrašyti, kopijuoti, viešinti ar perduoti tretiesiems asmenims pamokų, kitų dalyvių atvaizdo, balso ar mokomosios medžiagos.</w:t>
+        <w:t xml:space="preserve">Paslaugų gavėjas ir vaikas negali be atskiro Paslaugų teikėjo ir kitų duomenų subjektų teisėto pagrindo įrašyti, kopijuoti, viešinti ar perduoti tretiesiems asmenims užsiėmimų, kitų dalyvių atvaizdo, balso ar mokomosios medžiagos.</w:t>
       </w:r>
       <w:r>
         <w:rPr>
@@ -6141,7 +6141,7 @@
                 <w:u w:val="none"/>
                 <w:rtl w:val="0"/>
               </w:rPr>
-              <w:t xml:space="preserve">Pranešu, kad atsisakau nuotolinių papildomų pamokų (ugdomųjų veiklų) paslaugų sutarties.</w:t>
+              <w:t xml:space="preserve">Pranešu, kad atsisakau nuotolinių papildomų užsiėmimų (ugdomųjų veiklų) paslaugų sutarties.</w:t>
             </w:r>
             <w:r>
               <w:rPr>

</xml_diff>

<commit_message>
Parents download a blank extra-lessons withdrawal PDF they fill themselves and send to info@laisvivaikai.lt.
The accept page no longer shows a privacy notice, and teachers see which child uploaded homework.

Co-authored-by: Cursor <cursoragent@cursor.com>
</commit_message>
<xml_diff>
--- a/api/_lib/templates/extra-lessons-laisvi-vaikai.docx
+++ b/api/_lib/templates/extra-lessons-laisvi-vaikai.docx
@@ -1172,7 +1172,7 @@
           <w:u w:val="none"/>
           <w:rtl w:val="0"/>
         </w:rPr>
-        <w:t xml:space="preserve">Paslaugų teikėjas įsipareigoja organizuoti vaikui užsakytas nuotolines papildomus užsiėmimus ar ugdomąsias veiklas, o Paslaugų gavėjas įsipareigoja už tinkamai suteiktas paslaugas sumokėti šioje Sutartyje nustatyta tvarka.</w:t>
+        <w:t xml:space="preserve">Paslaugų teikėjas įsipareigoja organizuoti vaikui užsakytus nuotolinius papildomus užsiėmimus ar ugdomąsias veiklas, o Paslaugų gavėjas įsipareigoja už tinkamai suteiktas paslaugas sumokėti šioje Sutartyje nustatyta tvarka.</w:t>
       </w:r>
       <w:r>
         <w:rPr>
@@ -2701,7 +2701,7 @@
           <w:u w:val="none"/>
           <w:rtl w:val="0"/>
         </w:rPr>
-        <w:t xml:space="preserve">Jeigu užsakyta grupinis užsiėmimas pagal tvarkaraštį faktiškai įvyko ir vaikui buvo rezervuota vieta, užsiėmimas yra apmokama ir tuo atveju, kai vaikas joje nedalyvavo, išskyrus teisės aktuose arba šioje Sutartyje nurodytus atvejus. Ši sąlyga prieš užsakymą turi būti aiškiai išskirta užsakymo santraukoje.</w:t>
+        <w:t xml:space="preserve">Jeigu užsakytas grupinis užsiėmimas pagal tvarkaraštį faktiškai įvyko ir vaikui buvo rezervuota vieta, užsiėmimas yra apmokamas ir tuo atveju, kai vaikas jame nedalyvavo, išskyrus teisės aktuose arba šioje Sutartyje nurodytus atvejus. Ši sąlyga prieš užsakymą turi būti aiškiai išskirta užsakymo santraukoje.</w:t>
       </w:r>
       <w:r>
         <w:rPr>
@@ -2742,7 +2742,7 @@
           <w:u w:val="none"/>
           <w:rtl w:val="0"/>
         </w:rPr>
-        <w:t xml:space="preserve">Individualiems užsiėmimams taikomas toks atšaukimo terminas ir pasekmės: {{individualios_pamokos_atšaukimo_sąlygos}}. Jeigu individualios užsiėmimai neteikiamos, ši nuostata Sutarties kopijoje pažymima „netaikoma“.</w:t>
+        <w:t xml:space="preserve">Individualiems užsiėmimams taikomas 24 valandų atšaukimo terminas: individualus užsiėmimas atšaukiamas ne vėliau kaip 24 val. iki pradžios; vėliau užsiėmimas apmokamas. Jeigu šiuo užsakymu individualūs užsiėmimai neteikiami, ši nuostata Sutarties kopijoje pažymima „netaikoma“ ir taikomas 4.3 punktas.</w:t>
       </w:r>
       <w:r>
         <w:rPr>
@@ -2783,7 +2783,7 @@
           <w:u w:val="none"/>
           <w:rtl w:val="0"/>
         </w:rPr>
-        <w:t xml:space="preserve">Jeigu užsiėmimas neįvyksta dėl mokytojo ligos, Paslaugų teikėjo organizacinių sprendimų, jo pasirinktos platformos sutrikimo ar kitos nuo Paslaugų teikėjo priklausančios priežasties, mokestis už tokį užsiėmimą netaikomas arba, Paslaugų gavėjui sutikus, užsiėmimas perkeliama į kitą laiką.</w:t>
+        <w:t xml:space="preserve">Jeigu užsiėmimas neįvyksta dėl mokytojo ligos, Paslaugų teikėjo organizacinių sprendimų, jo pasirinktos platformos sutrikimo ar kitos nuo Paslaugų teikėjo priklausančios priežasties, mokestis už tokį užsiėmimą netaikomas arba, Paslaugų gavėjui sutikus, užsiėmimas perkeliamas į kitą laiką.</w:t>
       </w:r>
       <w:r>
         <w:rPr>
@@ -3439,7 +3439,7 @@
           <w:u w:val="none"/>
           <w:rtl w:val="0"/>
         </w:rPr>
-        <w:t xml:space="preserve">Sustabdymas nepanaikina pareigos apmokėti iki sustabdymo tinkamai suteiktas paslaugas, tačiau mokestis už po sustabdymo nesuteiktas užsiėmimas neskaičiuojamas.</w:t>
+        <w:t xml:space="preserve">Sustabdymas nepanaikina pareigos apmokėti iki sustabdymo tinkamai suteiktas paslaugas, tačiau mokestis už po sustabdymo nesuteiktus užsiėmimus neskaičiuojamas.</w:t>
       </w:r>
       <w:r>
         <w:rPr>
@@ -3709,7 +3709,7 @@
           <w:u w:val="none"/>
           <w:rtl w:val="0"/>
         </w:rPr>
-        <w:t xml:space="preserve">Jeigu Paslaugų gavėjas pageidauja, kad užsiėmimai būtų pradėtos teikti nepasibaigus 14 dienų terminui, jis prieš užsakymą atskiru, iš anksto nepažymėtu laukeliu pateikia aiškų prašymą: „Prašau pradėti teikti paslaugas nepasibaigus 14 dienų sutarties atsisakymo terminui. Suprantu, kad atsisakęs Sutarties turėsiu sumokėti už iki atsisakymo suteiktas paslaugas.“</w:t>
+        <w:t xml:space="preserve">Jeigu Paslaugų gavėjas pageidauja, kad užsiėmimai būtų pradėti teikti nepasibaigus 14 dienų terminui, jis prieš užsakymą atskiru, iš anksto nepažymėtu laukeliu pateikia aiškų prašymą: „Prašau pradėti teikti paslaugas nepasibaigus 14 dienų sutarties atsisakymo terminui. Suprantu, kad atsisakęs Sutarties turėsiu sumokėti už iki atsisakymo suteiktas paslaugas.“</w:t>
       </w:r>
       <w:r>
         <w:rPr>
@@ -4061,7 +4061,7 @@
           <w:u w:val="none"/>
           <w:rtl w:val="0"/>
         </w:rPr>
-        <w:t xml:space="preserve">• grasinimus, smurtą, patyčias, neteisėtą užsiėmimai įrašymą ar platinimą, saugumo incidentą arba kitą šiurkštų pažeidimą, dėl kurio pagrįstai negalima tęsti paslaugos;</w:t>
+        <w:t xml:space="preserve">• grasinimus, smurtą, patyčias, neteisėtą užsiėmimo įrašymą ar platinimą, saugumo incidentą arba kitą šiurkštų pažeidimą, dėl kurio pagrįstai negalima tęsti paslaugos;</w:t>
       </w:r>
       <w:r>
         <w:rPr>
@@ -4279,7 +4279,7 @@
           <w:u w:val="none"/>
           <w:rtl w:val="0"/>
         </w:rPr>
-        <w:t xml:space="preserve">Vaiko atvaizdas, balsas, pasisakymai, vardas ir kiti užsiėmimai metu fiksuojami duomenys yra asmens duomenys. Užsiėmimai, kuriose gali būti užfiksuoti vaiko asmens duomenys, įrašomos tik turint aiškų teisėtą pagrindą ir prieš tai pateikus išsamią informaciją apie įrašymo tikslą, duomenų gavėjus, saugojimo terminą, prieigos sąlygas ir duomenų subjekto teises.</w:t>
+        <w:t xml:space="preserve">Vaiko atvaizdas, balsas, pasisakymai, vardas ir kiti užsiėmimų metu fiksuojami duomenys yra asmens duomenys. Užsiėmimai, kuriuose gali būti užfiksuoti vaiko asmens duomenys, įrašomi tik turint aiškų teisėtą pagrindą ir prieš tai pateikus išsamią informaciją apie įrašymo tikslą, duomenų gavėjus, saugojimo terminą, prieigos sąlygas ir duomenų subjekto teises.</w:t>
       </w:r>
       <w:r>
         <w:rPr>
@@ -4361,7 +4361,7 @@
           <w:u w:val="none"/>
           <w:rtl w:val="0"/>
         </w:rPr>
-        <w:t xml:space="preserve">Tutlio sistemoje įrašymo sutikimo tekstas ir būsena fiksuojami atskirai. Pavyzdinė formuluotė: „Sutinku, kad nuotolinės užsiėmimai metu mano atstovaujamo vaiko vaizdas ir (ar) balsas būtų įrašomi tik {{tikslas}}, įrašą leidžiant peržiūrėti {{gavejai}} ir saugant ne ilgiau kaip {{saugojimo_terminas}}. Žinau, kad sutikimą galiu bet kada atšaukti, nedarant poveikio iki atšaukimo atlikto tvarkymo teisėtumui.“</w:t>
+        <w:t xml:space="preserve">Tutlio sistemoje įrašymo sutikimo tekstas ir būsena fiksuojami atskirai. Pavyzdinė formuluotė: „Sutinku, kad nuotolinių užsiėmimų metu mano atstovaujamo vaiko vaizdas ir (ar) balsas būtų įrašomi tik užsiėmimo tikslais, įrašą leidžiant peržiūrėti Mokyklos administracijai, paskirtiems mokytojams, tos pačios grupės vaikams ir jų atstovams pagal įstatymą ir saugant ne ilgiau kaip 30 kalendorinių dienų nuo užsiėmimo dienos. Žinau, kad sutikimą galiu bet kada atšaukti, nedarant poveikio iki atšaukimo atlikto tvarkymo teisėtumui.“</w:t>
       </w:r>
       <w:r>
         <w:rPr>
@@ -6793,7 +6793,7 @@
         <w:vertAlign w:val="baseline"/>
         <w:lang w:val="en-US"/>
       </w:rPr>
-      <w:t xml:space="preserve">VšĮ „Laisvi vaikai“ | Tutlio sistemos sutarties šablonas | Redakcija </w:t>
+      <w:t xml:space="preserve">VšĮ „Laisvi vaikai“ | Tutlio sistemos sutartis</w:t>
     </w:r>
     <w:r>
       <w:rPr>
@@ -6801,7 +6801,7 @@
         <w:szCs w:val="21"/>
         <w:lang w:val="en-US"/>
       </w:rPr>
-      <w:t xml:space="preserve">{{redakcijos_ID}}</w:t>
+      <w:t xml:space="preserve"/>
     </w:r>
     <w:r>
       <w:rPr>

</xml_diff>